<commit_message>
docs(handoff): ajout section §5 sur la dichotomie du notebook starter
Nouvelle section 5 du guide de passation : détaille les 8 cellules livrées
clés en main (plomberie technique : connexion AuraDB, chargement bulk,
exemple Louvain) et les 4 cellules à compléter (Leiden, Label Propagation,
PageRank, tableau §N2.2). Clarifie la logique du découpage : la plomberie
est universelle et n'entre pas dans l'évaluation académique ; les
algorithmes restants portent la note §N2.2.

Renumérotation : « Décisions à valider » passe de §5 à §6.

Co-Authored-By: Claude Opus 4.7 (1M context) <noreply@anthropic.com>
</commit_message>
<xml_diff>
--- a/docs/handoff/SKILLNAV_Guide_Modelisation_Structure_Mining.docx
+++ b/docs/handoff/SKILLNAV_Guide_Modelisation_Structure_Mining.docx
@@ -3104,7 +3104,1545 @@
           <w:sz w:val="32"/>
           <w:szCs w:val="32"/>
         </w:rPr>
-        <w:t xml:space="preserve">5. Décisions à valider avant Phase A</w:t>
+        <w:t xml:space="preserve">5. Détail du notebook 02_graph_starter.ipynb</w:t>
+      </w:r>
+    </w:p>
+    <w:p>
+      <w:pPr>
+        <w:spacing w:after="120" w:line="320"/>
+        <w:jc w:val="both"/>
+      </w:pPr>
+      <w:r>
+        <w:rPr>
+          <w:b w:val="false"/>
+          <w:bCs w:val="false"/>
+          <w:i w:val="false"/>
+          <w:iCs w:val="false"/>
+          <w:color w:val="424242"/>
+          <w:sz w:val="22"/>
+          <w:szCs w:val="22"/>
+        </w:rPr>
+        <w:t xml:space="preserve">Le notebook livré en Phase A est un starter kit dont le rôle est de préparer l'environnement Neo4j et de servir de patron pour le travail algorithmique. Sa structure est volontairement dichotomique : la moitié technique (connexion, chargement bulk, exemple Louvain commenté) est livrée prête à l'emploi ; l'autre moitié (trois algorithmes restants, interprétation, synthèse §N2.2) constitue le périmètre d'évaluation du volet Structure Mining.</w:t>
+      </w:r>
+    </w:p>
+    <w:p>
+      <w:pPr>
+        <w:pStyle w:val="Heading2"/>
+        <w:spacing w:after="140" w:before="300"/>
+      </w:pPr>
+      <w:r>
+        <w:rPr>
+          <w:b/>
+          <w:bCs/>
+          <w:color w:val="1565C0"/>
+          <w:sz w:val="26"/>
+          <w:szCs w:val="26"/>
+        </w:rPr>
+        <w:t xml:space="preserve">5.1 Cellules livrées clés en main (Phase A)</w:t>
+      </w:r>
+    </w:p>
+    <w:tbl>
+      <w:tblPr>
+        <w:tblW w:type="dxa" w:w="9026"/>
+        <w:tblBorders>
+          <w:top w:val="single" w:color="auto" w:sz="4"/>
+          <w:left w:val="single" w:color="auto" w:sz="4"/>
+          <w:bottom w:val="single" w:color="auto" w:sz="4"/>
+          <w:right w:val="single" w:color="auto" w:sz="4"/>
+          <w:insideH w:val="single" w:color="auto" w:sz="4"/>
+          <w:insideV w:val="single" w:color="auto" w:sz="4"/>
+        </w:tblBorders>
+      </w:tblPr>
+      <w:tblGrid>
+        <w:gridCol w:w="600"/>
+        <w:gridCol w:w="6000"/>
+        <w:gridCol w:w="2426"/>
+      </w:tblGrid>
+      <w:tr>
+        <w:trPr>
+          <w:tblHeader/>
+        </w:trPr>
+        <w:tc>
+          <w:tcPr>
+            <w:tcW w:type="dxa" w:w="600"/>
+            <w:tcBorders>
+              <w:top w:val="single" w:color="BDBDBD" w:sz="4"/>
+              <w:left w:val="single" w:color="BDBDBD" w:sz="4"/>
+              <w:bottom w:val="single" w:color="BDBDBD" w:sz="4"/>
+              <w:right w:val="single" w:color="BDBDBD" w:sz="4"/>
+            </w:tcBorders>
+            <w:shd w:fill="E3F2FD" w:val="clear"/>
+            <w:tcMar>
+              <w:top w:type="dxa" w:w="100"/>
+              <w:left w:type="dxa" w:w="140"/>
+              <w:bottom w:type="dxa" w:w="100"/>
+              <w:right w:type="dxa" w:w="140"/>
+            </w:tcMar>
+          </w:tcPr>
+          <w:p>
+            <w:pPr>
+              <w:spacing w:after="40"/>
+            </w:pPr>
+            <w:r>
+              <w:rPr>
+                <w:b/>
+                <w:bCs/>
+                <w:color w:val="1565C0"/>
+                <w:sz w:val="20"/>
+                <w:szCs w:val="20"/>
+              </w:rPr>
+              <w:t xml:space="preserve">§</w:t>
+            </w:r>
+          </w:p>
+        </w:tc>
+        <w:tc>
+          <w:tcPr>
+            <w:tcW w:type="dxa" w:w="6000"/>
+            <w:tcBorders>
+              <w:top w:val="single" w:color="BDBDBD" w:sz="4"/>
+              <w:left w:val="single" w:color="BDBDBD" w:sz="4"/>
+              <w:bottom w:val="single" w:color="BDBDBD" w:sz="4"/>
+              <w:right w:val="single" w:color="BDBDBD" w:sz="4"/>
+            </w:tcBorders>
+            <w:shd w:fill="E3F2FD" w:val="clear"/>
+            <w:tcMar>
+              <w:top w:type="dxa" w:w="100"/>
+              <w:left w:type="dxa" w:w="140"/>
+              <w:bottom w:type="dxa" w:w="100"/>
+              <w:right w:type="dxa" w:w="140"/>
+            </w:tcMar>
+          </w:tcPr>
+          <w:p>
+            <w:pPr>
+              <w:spacing w:after="40"/>
+            </w:pPr>
+            <w:r>
+              <w:rPr>
+                <w:b/>
+                <w:bCs/>
+                <w:color w:val="1565C0"/>
+                <w:sz w:val="20"/>
+                <w:szCs w:val="20"/>
+              </w:rPr>
+              <w:t xml:space="preserve">Section du notebook</w:t>
+            </w:r>
+          </w:p>
+        </w:tc>
+        <w:tc>
+          <w:tcPr>
+            <w:tcW w:type="dxa" w:w="2426"/>
+            <w:tcBorders>
+              <w:top w:val="single" w:color="BDBDBD" w:sz="4"/>
+              <w:left w:val="single" w:color="BDBDBD" w:sz="4"/>
+              <w:bottom w:val="single" w:color="BDBDBD" w:sz="4"/>
+              <w:right w:val="single" w:color="BDBDBD" w:sz="4"/>
+            </w:tcBorders>
+            <w:shd w:fill="E3F2FD" w:val="clear"/>
+            <w:tcMar>
+              <w:top w:type="dxa" w:w="100"/>
+              <w:left w:type="dxa" w:w="140"/>
+              <w:bottom w:type="dxa" w:w="100"/>
+              <w:right w:type="dxa" w:w="140"/>
+            </w:tcMar>
+          </w:tcPr>
+          <w:p>
+            <w:pPr>
+              <w:spacing w:after="40"/>
+            </w:pPr>
+            <w:r>
+              <w:rPr>
+                <w:b/>
+                <w:bCs/>
+                <w:color w:val="1565C0"/>
+                <w:sz w:val="20"/>
+                <w:szCs w:val="20"/>
+              </w:rPr>
+              <w:t xml:space="preserve">État</w:t>
+            </w:r>
+          </w:p>
+        </w:tc>
+      </w:tr>
+      <w:tr>
+        <w:tc>
+          <w:tcPr>
+            <w:tcW w:type="dxa" w:w="600"/>
+            <w:tcBorders>
+              <w:top w:val="single" w:color="BDBDBD" w:sz="4"/>
+              <w:left w:val="single" w:color="BDBDBD" w:sz="4"/>
+              <w:bottom w:val="single" w:color="BDBDBD" w:sz="4"/>
+              <w:right w:val="single" w:color="BDBDBD" w:sz="4"/>
+            </w:tcBorders>
+            <w:tcMar>
+              <w:top w:type="dxa" w:w="100"/>
+              <w:left w:type="dxa" w:w="140"/>
+              <w:bottom w:type="dxa" w:w="100"/>
+              <w:right w:type="dxa" w:w="140"/>
+            </w:tcMar>
+          </w:tcPr>
+          <w:p>
+            <w:pPr>
+              <w:spacing w:after="40"/>
+            </w:pPr>
+            <w:r>
+              <w:rPr>
+                <w:b w:val="false"/>
+                <w:bCs w:val="false"/>
+                <w:color w:val="424242"/>
+                <w:sz w:val="20"/>
+                <w:szCs w:val="20"/>
+              </w:rPr>
+              <w:t xml:space="preserve">0</w:t>
+            </w:r>
+          </w:p>
+        </w:tc>
+        <w:tc>
+          <w:tcPr>
+            <w:tcW w:type="dxa" w:w="6000"/>
+            <w:tcBorders>
+              <w:top w:val="single" w:color="BDBDBD" w:sz="4"/>
+              <w:left w:val="single" w:color="BDBDBD" w:sz="4"/>
+              <w:bottom w:val="single" w:color="BDBDBD" w:sz="4"/>
+              <w:right w:val="single" w:color="BDBDBD" w:sz="4"/>
+            </w:tcBorders>
+            <w:tcMar>
+              <w:top w:type="dxa" w:w="100"/>
+              <w:left w:type="dxa" w:w="140"/>
+              <w:bottom w:type="dxa" w:w="100"/>
+              <w:right w:type="dxa" w:w="140"/>
+            </w:tcMar>
+          </w:tcPr>
+          <w:p>
+            <w:pPr>
+              <w:spacing w:after="40"/>
+            </w:pPr>
+            <w:r>
+              <w:rPr>
+                <w:b w:val="false"/>
+                <w:bCs w:val="false"/>
+                <w:color w:val="424242"/>
+                <w:sz w:val="20"/>
+                <w:szCs w:val="20"/>
+              </w:rPr>
+              <w:t xml:space="preserve">Setup : connexion Neo4j AuraDB via .env</w:t>
+            </w:r>
+          </w:p>
+        </w:tc>
+        <w:tc>
+          <w:tcPr>
+            <w:tcW w:type="dxa" w:w="2426"/>
+            <w:tcBorders>
+              <w:top w:val="single" w:color="BDBDBD" w:sz="4"/>
+              <w:left w:val="single" w:color="BDBDBD" w:sz="4"/>
+              <w:bottom w:val="single" w:color="BDBDBD" w:sz="4"/>
+              <w:right w:val="single" w:color="BDBDBD" w:sz="4"/>
+            </w:tcBorders>
+            <w:tcMar>
+              <w:top w:type="dxa" w:w="100"/>
+              <w:left w:type="dxa" w:w="140"/>
+              <w:bottom w:type="dxa" w:w="100"/>
+              <w:right w:type="dxa" w:w="140"/>
+            </w:tcMar>
+          </w:tcPr>
+          <w:p>
+            <w:pPr>
+              <w:spacing w:after="40"/>
+            </w:pPr>
+            <w:r>
+              <w:rPr>
+                <w:b w:val="false"/>
+                <w:bCs w:val="false"/>
+                <w:color w:val="424242"/>
+                <w:sz w:val="20"/>
+                <w:szCs w:val="20"/>
+              </w:rPr>
+              <w:t xml:space="preserve">Prête à exécuter</w:t>
+            </w:r>
+          </w:p>
+        </w:tc>
+      </w:tr>
+      <w:tr>
+        <w:tc>
+          <w:tcPr>
+            <w:tcW w:type="dxa" w:w="600"/>
+            <w:tcBorders>
+              <w:top w:val="single" w:color="BDBDBD" w:sz="4"/>
+              <w:left w:val="single" w:color="BDBDBD" w:sz="4"/>
+              <w:bottom w:val="single" w:color="BDBDBD" w:sz="4"/>
+              <w:right w:val="single" w:color="BDBDBD" w:sz="4"/>
+            </w:tcBorders>
+            <w:tcMar>
+              <w:top w:type="dxa" w:w="100"/>
+              <w:left w:type="dxa" w:w="140"/>
+              <w:bottom w:type="dxa" w:w="100"/>
+              <w:right w:type="dxa" w:w="140"/>
+            </w:tcMar>
+          </w:tcPr>
+          <w:p>
+            <w:pPr>
+              <w:spacing w:after="40"/>
+            </w:pPr>
+            <w:r>
+              <w:rPr>
+                <w:b w:val="false"/>
+                <w:bCs w:val="false"/>
+                <w:color w:val="424242"/>
+                <w:sz w:val="20"/>
+                <w:szCs w:val="20"/>
+              </w:rPr>
+              <w:t xml:space="preserve">1</w:t>
+            </w:r>
+          </w:p>
+        </w:tc>
+        <w:tc>
+          <w:tcPr>
+            <w:tcW w:type="dxa" w:w="6000"/>
+            <w:tcBorders>
+              <w:top w:val="single" w:color="BDBDBD" w:sz="4"/>
+              <w:left w:val="single" w:color="BDBDBD" w:sz="4"/>
+              <w:bottom w:val="single" w:color="BDBDBD" w:sz="4"/>
+              <w:right w:val="single" w:color="BDBDBD" w:sz="4"/>
+            </w:tcBorders>
+            <w:tcMar>
+              <w:top w:type="dxa" w:w="100"/>
+              <w:left w:type="dxa" w:w="140"/>
+              <w:bottom w:type="dxa" w:w="100"/>
+              <w:right w:type="dxa" w:w="140"/>
+            </w:tcMar>
+          </w:tcPr>
+          <w:p>
+            <w:pPr>
+              <w:spacing w:after="40"/>
+            </w:pPr>
+            <w:r>
+              <w:rPr>
+                <w:b w:val="false"/>
+                <w:bCs w:val="false"/>
+                <w:color w:val="424242"/>
+                <w:sz w:val="20"/>
+                <w:szCs w:val="20"/>
+              </w:rPr>
+              <w:t xml:space="preserve">Vérification des artefacts CSV générés par build_dataset.py</w:t>
+            </w:r>
+          </w:p>
+        </w:tc>
+        <w:tc>
+          <w:tcPr>
+            <w:tcW w:type="dxa" w:w="2426"/>
+            <w:tcBorders>
+              <w:top w:val="single" w:color="BDBDBD" w:sz="4"/>
+              <w:left w:val="single" w:color="BDBDBD" w:sz="4"/>
+              <w:bottom w:val="single" w:color="BDBDBD" w:sz="4"/>
+              <w:right w:val="single" w:color="BDBDBD" w:sz="4"/>
+            </w:tcBorders>
+            <w:tcMar>
+              <w:top w:type="dxa" w:w="100"/>
+              <w:left w:type="dxa" w:w="140"/>
+              <w:bottom w:type="dxa" w:w="100"/>
+              <w:right w:type="dxa" w:w="140"/>
+            </w:tcMar>
+          </w:tcPr>
+          <w:p>
+            <w:pPr>
+              <w:spacing w:after="40"/>
+            </w:pPr>
+            <w:r>
+              <w:rPr>
+                <w:b w:val="false"/>
+                <w:bCs w:val="false"/>
+                <w:color w:val="424242"/>
+                <w:sz w:val="20"/>
+                <w:szCs w:val="20"/>
+              </w:rPr>
+              <w:t xml:space="preserve">Prête à exécuter</w:t>
+            </w:r>
+          </w:p>
+        </w:tc>
+      </w:tr>
+      <w:tr>
+        <w:tc>
+          <w:tcPr>
+            <w:tcW w:type="dxa" w:w="600"/>
+            <w:tcBorders>
+              <w:top w:val="single" w:color="BDBDBD" w:sz="4"/>
+              <w:left w:val="single" w:color="BDBDBD" w:sz="4"/>
+              <w:bottom w:val="single" w:color="BDBDBD" w:sz="4"/>
+              <w:right w:val="single" w:color="BDBDBD" w:sz="4"/>
+            </w:tcBorders>
+            <w:tcMar>
+              <w:top w:type="dxa" w:w="100"/>
+              <w:left w:type="dxa" w:w="140"/>
+              <w:bottom w:type="dxa" w:w="100"/>
+              <w:right w:type="dxa" w:w="140"/>
+            </w:tcMar>
+          </w:tcPr>
+          <w:p>
+            <w:pPr>
+              <w:spacing w:after="40"/>
+            </w:pPr>
+            <w:r>
+              <w:rPr>
+                <w:b w:val="false"/>
+                <w:bCs w:val="false"/>
+                <w:color w:val="424242"/>
+                <w:sz w:val="20"/>
+                <w:szCs w:val="20"/>
+              </w:rPr>
+              <w:t xml:space="preserve">2</w:t>
+            </w:r>
+          </w:p>
+        </w:tc>
+        <w:tc>
+          <w:tcPr>
+            <w:tcW w:type="dxa" w:w="6000"/>
+            <w:tcBorders>
+              <w:top w:val="single" w:color="BDBDBD" w:sz="4"/>
+              <w:left w:val="single" w:color="BDBDBD" w:sz="4"/>
+              <w:bottom w:val="single" w:color="BDBDBD" w:sz="4"/>
+              <w:right w:val="single" w:color="BDBDBD" w:sz="4"/>
+            </w:tcBorders>
+            <w:tcMar>
+              <w:top w:type="dxa" w:w="100"/>
+              <w:left w:type="dxa" w:w="140"/>
+              <w:bottom w:type="dxa" w:w="100"/>
+              <w:right w:type="dxa" w:w="140"/>
+            </w:tcMar>
+          </w:tcPr>
+          <w:p>
+            <w:pPr>
+              <w:spacing w:after="40"/>
+            </w:pPr>
+            <w:r>
+              <w:rPr>
+                <w:b w:val="false"/>
+                <w:bCs w:val="false"/>
+                <w:color w:val="424242"/>
+                <w:sz w:val="20"/>
+                <w:szCs w:val="20"/>
+              </w:rPr>
+              <w:t xml:space="preserve">Contraintes d'unicité et index Cypher</w:t>
+            </w:r>
+          </w:p>
+        </w:tc>
+        <w:tc>
+          <w:tcPr>
+            <w:tcW w:type="dxa" w:w="2426"/>
+            <w:tcBorders>
+              <w:top w:val="single" w:color="BDBDBD" w:sz="4"/>
+              <w:left w:val="single" w:color="BDBDBD" w:sz="4"/>
+              <w:bottom w:val="single" w:color="BDBDBD" w:sz="4"/>
+              <w:right w:val="single" w:color="BDBDBD" w:sz="4"/>
+            </w:tcBorders>
+            <w:tcMar>
+              <w:top w:type="dxa" w:w="100"/>
+              <w:left w:type="dxa" w:w="140"/>
+              <w:bottom w:type="dxa" w:w="100"/>
+              <w:right w:type="dxa" w:w="140"/>
+            </w:tcMar>
+          </w:tcPr>
+          <w:p>
+            <w:pPr>
+              <w:spacing w:after="40"/>
+            </w:pPr>
+            <w:r>
+              <w:rPr>
+                <w:b w:val="false"/>
+                <w:bCs w:val="false"/>
+                <w:color w:val="424242"/>
+                <w:sz w:val="20"/>
+                <w:szCs w:val="20"/>
+              </w:rPr>
+              <w:t xml:space="preserve">Prête à exécuter</w:t>
+            </w:r>
+          </w:p>
+        </w:tc>
+      </w:tr>
+      <w:tr>
+        <w:tc>
+          <w:tcPr>
+            <w:tcW w:type="dxa" w:w="600"/>
+            <w:tcBorders>
+              <w:top w:val="single" w:color="BDBDBD" w:sz="4"/>
+              <w:left w:val="single" w:color="BDBDBD" w:sz="4"/>
+              <w:bottom w:val="single" w:color="BDBDBD" w:sz="4"/>
+              <w:right w:val="single" w:color="BDBDBD" w:sz="4"/>
+            </w:tcBorders>
+            <w:tcMar>
+              <w:top w:type="dxa" w:w="100"/>
+              <w:left w:type="dxa" w:w="140"/>
+              <w:bottom w:type="dxa" w:w="100"/>
+              <w:right w:type="dxa" w:w="140"/>
+            </w:tcMar>
+          </w:tcPr>
+          <w:p>
+            <w:pPr>
+              <w:spacing w:after="40"/>
+            </w:pPr>
+            <w:r>
+              <w:rPr>
+                <w:b w:val="false"/>
+                <w:bCs w:val="false"/>
+                <w:color w:val="424242"/>
+                <w:sz w:val="20"/>
+                <w:szCs w:val="20"/>
+              </w:rPr>
+              <w:t xml:space="preserve">3</w:t>
+            </w:r>
+          </w:p>
+        </w:tc>
+        <w:tc>
+          <w:tcPr>
+            <w:tcW w:type="dxa" w:w="6000"/>
+            <w:tcBorders>
+              <w:top w:val="single" w:color="BDBDBD" w:sz="4"/>
+              <w:left w:val="single" w:color="BDBDBD" w:sz="4"/>
+              <w:bottom w:val="single" w:color="BDBDBD" w:sz="4"/>
+              <w:right w:val="single" w:color="BDBDBD" w:sz="4"/>
+            </w:tcBorders>
+            <w:tcMar>
+              <w:top w:type="dxa" w:w="100"/>
+              <w:left w:type="dxa" w:w="140"/>
+              <w:bottom w:type="dxa" w:w="100"/>
+              <w:right w:type="dxa" w:w="140"/>
+            </w:tcMar>
+          </w:tcPr>
+          <w:p>
+            <w:pPr>
+              <w:spacing w:after="40"/>
+            </w:pPr>
+            <w:r>
+              <w:rPr>
+                <w:b w:val="false"/>
+                <w:bCs w:val="false"/>
+                <w:color w:val="424242"/>
+                <w:sz w:val="20"/>
+                <w:szCs w:val="20"/>
+              </w:rPr>
+              <w:t xml:space="preserve">Chargement bulk des 13 071 nœuds (UNWIND par batches de 500)</w:t>
+            </w:r>
+          </w:p>
+        </w:tc>
+        <w:tc>
+          <w:tcPr>
+            <w:tcW w:type="dxa" w:w="2426"/>
+            <w:tcBorders>
+              <w:top w:val="single" w:color="BDBDBD" w:sz="4"/>
+              <w:left w:val="single" w:color="BDBDBD" w:sz="4"/>
+              <w:bottom w:val="single" w:color="BDBDBD" w:sz="4"/>
+              <w:right w:val="single" w:color="BDBDBD" w:sz="4"/>
+            </w:tcBorders>
+            <w:tcMar>
+              <w:top w:type="dxa" w:w="100"/>
+              <w:left w:type="dxa" w:w="140"/>
+              <w:bottom w:type="dxa" w:w="100"/>
+              <w:right w:type="dxa" w:w="140"/>
+            </w:tcMar>
+          </w:tcPr>
+          <w:p>
+            <w:pPr>
+              <w:spacing w:after="40"/>
+            </w:pPr>
+            <w:r>
+              <w:rPr>
+                <w:b w:val="false"/>
+                <w:bCs w:val="false"/>
+                <w:color w:val="424242"/>
+                <w:sz w:val="20"/>
+                <w:szCs w:val="20"/>
+              </w:rPr>
+              <w:t xml:space="preserve">Prête à exécuter</w:t>
+            </w:r>
+          </w:p>
+        </w:tc>
+      </w:tr>
+      <w:tr>
+        <w:tc>
+          <w:tcPr>
+            <w:tcW w:type="dxa" w:w="600"/>
+            <w:tcBorders>
+              <w:top w:val="single" w:color="BDBDBD" w:sz="4"/>
+              <w:left w:val="single" w:color="BDBDBD" w:sz="4"/>
+              <w:bottom w:val="single" w:color="BDBDBD" w:sz="4"/>
+              <w:right w:val="single" w:color="BDBDBD" w:sz="4"/>
+            </w:tcBorders>
+            <w:tcMar>
+              <w:top w:type="dxa" w:w="100"/>
+              <w:left w:type="dxa" w:w="140"/>
+              <w:bottom w:type="dxa" w:w="100"/>
+              <w:right w:type="dxa" w:w="140"/>
+            </w:tcMar>
+          </w:tcPr>
+          <w:p>
+            <w:pPr>
+              <w:spacing w:after="40"/>
+            </w:pPr>
+            <w:r>
+              <w:rPr>
+                <w:b w:val="false"/>
+                <w:bCs w:val="false"/>
+                <w:color w:val="424242"/>
+                <w:sz w:val="20"/>
+                <w:szCs w:val="20"/>
+              </w:rPr>
+              <w:t xml:space="preserve">4</w:t>
+            </w:r>
+          </w:p>
+        </w:tc>
+        <w:tc>
+          <w:tcPr>
+            <w:tcW w:type="dxa" w:w="6000"/>
+            <w:tcBorders>
+              <w:top w:val="single" w:color="BDBDBD" w:sz="4"/>
+              <w:left w:val="single" w:color="BDBDBD" w:sz="4"/>
+              <w:bottom w:val="single" w:color="BDBDBD" w:sz="4"/>
+              <w:right w:val="single" w:color="BDBDBD" w:sz="4"/>
+            </w:tcBorders>
+            <w:tcMar>
+              <w:top w:type="dxa" w:w="100"/>
+              <w:left w:type="dxa" w:w="140"/>
+              <w:bottom w:type="dxa" w:w="100"/>
+              <w:right w:type="dxa" w:w="140"/>
+            </w:tcMar>
+          </w:tcPr>
+          <w:p>
+            <w:pPr>
+              <w:spacing w:after="40"/>
+            </w:pPr>
+            <w:r>
+              <w:rPr>
+                <w:b w:val="false"/>
+                <w:bCs w:val="false"/>
+                <w:color w:val="424242"/>
+                <w:sz w:val="20"/>
+                <w:szCs w:val="20"/>
+              </w:rPr>
+              <w:t xml:space="preserve">Chargement bulk des 62 341 arêtes (REQUIRES et POSTED_BY)</w:t>
+            </w:r>
+          </w:p>
+        </w:tc>
+        <w:tc>
+          <w:tcPr>
+            <w:tcW w:type="dxa" w:w="2426"/>
+            <w:tcBorders>
+              <w:top w:val="single" w:color="BDBDBD" w:sz="4"/>
+              <w:left w:val="single" w:color="BDBDBD" w:sz="4"/>
+              <w:bottom w:val="single" w:color="BDBDBD" w:sz="4"/>
+              <w:right w:val="single" w:color="BDBDBD" w:sz="4"/>
+            </w:tcBorders>
+            <w:tcMar>
+              <w:top w:type="dxa" w:w="100"/>
+              <w:left w:type="dxa" w:w="140"/>
+              <w:bottom w:type="dxa" w:w="100"/>
+              <w:right w:type="dxa" w:w="140"/>
+            </w:tcMar>
+          </w:tcPr>
+          <w:p>
+            <w:pPr>
+              <w:spacing w:after="40"/>
+            </w:pPr>
+            <w:r>
+              <w:rPr>
+                <w:b w:val="false"/>
+                <w:bCs w:val="false"/>
+                <w:color w:val="424242"/>
+                <w:sz w:val="20"/>
+                <w:szCs w:val="20"/>
+              </w:rPr>
+              <w:t xml:space="preserve">Prête à exécuter</w:t>
+            </w:r>
+          </w:p>
+        </w:tc>
+      </w:tr>
+      <w:tr>
+        <w:tc>
+          <w:tcPr>
+            <w:tcW w:type="dxa" w:w="600"/>
+            <w:tcBorders>
+              <w:top w:val="single" w:color="BDBDBD" w:sz="4"/>
+              <w:left w:val="single" w:color="BDBDBD" w:sz="4"/>
+              <w:bottom w:val="single" w:color="BDBDBD" w:sz="4"/>
+              <w:right w:val="single" w:color="BDBDBD" w:sz="4"/>
+            </w:tcBorders>
+            <w:tcMar>
+              <w:top w:type="dxa" w:w="100"/>
+              <w:left w:type="dxa" w:w="140"/>
+              <w:bottom w:type="dxa" w:w="100"/>
+              <w:right w:type="dxa" w:w="140"/>
+            </w:tcMar>
+          </w:tcPr>
+          <w:p>
+            <w:pPr>
+              <w:spacing w:after="40"/>
+            </w:pPr>
+            <w:r>
+              <w:rPr>
+                <w:b w:val="false"/>
+                <w:bCs w:val="false"/>
+                <w:color w:val="424242"/>
+                <w:sz w:val="20"/>
+                <w:szCs w:val="20"/>
+              </w:rPr>
+              <w:t xml:space="preserve">5</w:t>
+            </w:r>
+          </w:p>
+        </w:tc>
+        <w:tc>
+          <w:tcPr>
+            <w:tcW w:type="dxa" w:w="6000"/>
+            <w:tcBorders>
+              <w:top w:val="single" w:color="BDBDBD" w:sz="4"/>
+              <w:left w:val="single" w:color="BDBDBD" w:sz="4"/>
+              <w:bottom w:val="single" w:color="BDBDBD" w:sz="4"/>
+              <w:right w:val="single" w:color="BDBDBD" w:sz="4"/>
+            </w:tcBorders>
+            <w:tcMar>
+              <w:top w:type="dxa" w:w="100"/>
+              <w:left w:type="dxa" w:w="140"/>
+              <w:bottom w:type="dxa" w:w="100"/>
+              <w:right w:type="dxa" w:w="140"/>
+            </w:tcMar>
+          </w:tcPr>
+          <w:p>
+            <w:pPr>
+              <w:spacing w:after="40"/>
+            </w:pPr>
+            <w:r>
+              <w:rPr>
+                <w:b w:val="false"/>
+                <w:bCs w:val="false"/>
+                <w:color w:val="424242"/>
+                <w:sz w:val="20"/>
+                <w:szCs w:val="20"/>
+              </w:rPr>
+              <w:t xml:space="preserve">Validation par comptages côté Neo4j</w:t>
+            </w:r>
+          </w:p>
+        </w:tc>
+        <w:tc>
+          <w:tcPr>
+            <w:tcW w:type="dxa" w:w="2426"/>
+            <w:tcBorders>
+              <w:top w:val="single" w:color="BDBDBD" w:sz="4"/>
+              <w:left w:val="single" w:color="BDBDBD" w:sz="4"/>
+              <w:bottom w:val="single" w:color="BDBDBD" w:sz="4"/>
+              <w:right w:val="single" w:color="BDBDBD" w:sz="4"/>
+            </w:tcBorders>
+            <w:tcMar>
+              <w:top w:type="dxa" w:w="100"/>
+              <w:left w:type="dxa" w:w="140"/>
+              <w:bottom w:type="dxa" w:w="100"/>
+              <w:right w:type="dxa" w:w="140"/>
+            </w:tcMar>
+          </w:tcPr>
+          <w:p>
+            <w:pPr>
+              <w:spacing w:after="40"/>
+            </w:pPr>
+            <w:r>
+              <w:rPr>
+                <w:b w:val="false"/>
+                <w:bCs w:val="false"/>
+                <w:color w:val="424242"/>
+                <w:sz w:val="20"/>
+                <w:szCs w:val="20"/>
+              </w:rPr>
+              <w:t xml:space="preserve">Prête à exécuter</w:t>
+            </w:r>
+          </w:p>
+        </w:tc>
+      </w:tr>
+      <w:tr>
+        <w:tc>
+          <w:tcPr>
+            <w:tcW w:type="dxa" w:w="600"/>
+            <w:tcBorders>
+              <w:top w:val="single" w:color="BDBDBD" w:sz="4"/>
+              <w:left w:val="single" w:color="BDBDBD" w:sz="4"/>
+              <w:bottom w:val="single" w:color="BDBDBD" w:sz="4"/>
+              <w:right w:val="single" w:color="BDBDBD" w:sz="4"/>
+            </w:tcBorders>
+            <w:tcMar>
+              <w:top w:type="dxa" w:w="100"/>
+              <w:left w:type="dxa" w:w="140"/>
+              <w:bottom w:type="dxa" w:w="100"/>
+              <w:right w:type="dxa" w:w="140"/>
+            </w:tcMar>
+          </w:tcPr>
+          <w:p>
+            <w:pPr>
+              <w:spacing w:after="40"/>
+            </w:pPr>
+            <w:r>
+              <w:rPr>
+                <w:b w:val="false"/>
+                <w:bCs w:val="false"/>
+                <w:color w:val="424242"/>
+                <w:sz w:val="20"/>
+                <w:szCs w:val="20"/>
+              </w:rPr>
+              <w:t xml:space="preserve">6</w:t>
+            </w:r>
+          </w:p>
+        </w:tc>
+        <w:tc>
+          <w:tcPr>
+            <w:tcW w:type="dxa" w:w="6000"/>
+            <w:tcBorders>
+              <w:top w:val="single" w:color="BDBDBD" w:sz="4"/>
+              <w:left w:val="single" w:color="BDBDBD" w:sz="4"/>
+              <w:bottom w:val="single" w:color="BDBDBD" w:sz="4"/>
+              <w:right w:val="single" w:color="BDBDBD" w:sz="4"/>
+            </w:tcBorders>
+            <w:tcMar>
+              <w:top w:type="dxa" w:w="100"/>
+              <w:left w:type="dxa" w:w="140"/>
+              <w:bottom w:type="dxa" w:w="100"/>
+              <w:right w:type="dxa" w:w="140"/>
+            </w:tcMar>
+          </w:tcPr>
+          <w:p>
+            <w:pPr>
+              <w:spacing w:after="40"/>
+            </w:pPr>
+            <w:r>
+              <w:rPr>
+                <w:b w:val="false"/>
+                <w:bCs w:val="false"/>
+                <w:color w:val="424242"/>
+                <w:sz w:val="20"/>
+                <w:szCs w:val="20"/>
+              </w:rPr>
+              <w:t xml:space="preserve">Exemple complet : algorithme Louvain (commenté)</w:t>
+            </w:r>
+          </w:p>
+        </w:tc>
+        <w:tc>
+          <w:tcPr>
+            <w:tcW w:type="dxa" w:w="2426"/>
+            <w:tcBorders>
+              <w:top w:val="single" w:color="BDBDBD" w:sz="4"/>
+              <w:left w:val="single" w:color="BDBDBD" w:sz="4"/>
+              <w:bottom w:val="single" w:color="BDBDBD" w:sz="4"/>
+              <w:right w:val="single" w:color="BDBDBD" w:sz="4"/>
+            </w:tcBorders>
+            <w:tcMar>
+              <w:top w:type="dxa" w:w="100"/>
+              <w:left w:type="dxa" w:w="140"/>
+              <w:bottom w:type="dxa" w:w="100"/>
+              <w:right w:type="dxa" w:w="140"/>
+            </w:tcMar>
+          </w:tcPr>
+          <w:p>
+            <w:pPr>
+              <w:spacing w:after="40"/>
+            </w:pPr>
+            <w:r>
+              <w:rPr>
+                <w:b w:val="false"/>
+                <w:bCs w:val="false"/>
+                <w:color w:val="424242"/>
+                <w:sz w:val="20"/>
+                <w:szCs w:val="20"/>
+              </w:rPr>
+              <w:t xml:space="preserve">Prête à exécuter, sert de patron</w:t>
+            </w:r>
+          </w:p>
+        </w:tc>
+      </w:tr>
+      <w:tr>
+        <w:tc>
+          <w:tcPr>
+            <w:tcW w:type="dxa" w:w="600"/>
+            <w:tcBorders>
+              <w:top w:val="single" w:color="BDBDBD" w:sz="4"/>
+              <w:left w:val="single" w:color="BDBDBD" w:sz="4"/>
+              <w:bottom w:val="single" w:color="BDBDBD" w:sz="4"/>
+              <w:right w:val="single" w:color="BDBDBD" w:sz="4"/>
+            </w:tcBorders>
+            <w:tcMar>
+              <w:top w:type="dxa" w:w="100"/>
+              <w:left w:type="dxa" w:w="140"/>
+              <w:bottom w:type="dxa" w:w="100"/>
+              <w:right w:type="dxa" w:w="140"/>
+            </w:tcMar>
+          </w:tcPr>
+          <w:p>
+            <w:pPr>
+              <w:spacing w:after="40"/>
+            </w:pPr>
+            <w:r>
+              <w:rPr>
+                <w:b w:val="false"/>
+                <w:bCs w:val="false"/>
+                <w:color w:val="424242"/>
+                <w:sz w:val="20"/>
+                <w:szCs w:val="20"/>
+              </w:rPr>
+              <w:t xml:space="preserve">9</w:t>
+            </w:r>
+          </w:p>
+        </w:tc>
+        <w:tc>
+          <w:tcPr>
+            <w:tcW w:type="dxa" w:w="6000"/>
+            <w:tcBorders>
+              <w:top w:val="single" w:color="BDBDBD" w:sz="4"/>
+              <w:left w:val="single" w:color="BDBDBD" w:sz="4"/>
+              <w:bottom w:val="single" w:color="BDBDBD" w:sz="4"/>
+              <w:right w:val="single" w:color="BDBDBD" w:sz="4"/>
+            </w:tcBorders>
+            <w:tcMar>
+              <w:top w:type="dxa" w:w="100"/>
+              <w:left w:type="dxa" w:w="140"/>
+              <w:bottom w:type="dxa" w:w="100"/>
+              <w:right w:type="dxa" w:w="140"/>
+            </w:tcMar>
+          </w:tcPr>
+          <w:p>
+            <w:pPr>
+              <w:spacing w:after="40"/>
+            </w:pPr>
+            <w:r>
+              <w:rPr>
+                <w:b w:val="false"/>
+                <w:bCs w:val="false"/>
+                <w:color w:val="424242"/>
+                <w:sz w:val="20"/>
+                <w:szCs w:val="20"/>
+              </w:rPr>
+              <w:t xml:space="preserve">Fermeture propre du driver Neo4j</w:t>
+            </w:r>
+          </w:p>
+        </w:tc>
+        <w:tc>
+          <w:tcPr>
+            <w:tcW w:type="dxa" w:w="2426"/>
+            <w:tcBorders>
+              <w:top w:val="single" w:color="BDBDBD" w:sz="4"/>
+              <w:left w:val="single" w:color="BDBDBD" w:sz="4"/>
+              <w:bottom w:val="single" w:color="BDBDBD" w:sz="4"/>
+              <w:right w:val="single" w:color="BDBDBD" w:sz="4"/>
+            </w:tcBorders>
+            <w:tcMar>
+              <w:top w:type="dxa" w:w="100"/>
+              <w:left w:type="dxa" w:w="140"/>
+              <w:bottom w:type="dxa" w:w="100"/>
+              <w:right w:type="dxa" w:w="140"/>
+            </w:tcMar>
+          </w:tcPr>
+          <w:p>
+            <w:pPr>
+              <w:spacing w:after="40"/>
+            </w:pPr>
+            <w:r>
+              <w:rPr>
+                <w:b w:val="false"/>
+                <w:bCs w:val="false"/>
+                <w:color w:val="424242"/>
+                <w:sz w:val="20"/>
+                <w:szCs w:val="20"/>
+              </w:rPr>
+              <w:t xml:space="preserve">Prête à exécuter</w:t>
+            </w:r>
+          </w:p>
+        </w:tc>
+      </w:tr>
+    </w:tbl>
+    <w:p>
+      <w:pPr>
+        <w:pStyle w:val="Heading2"/>
+        <w:spacing w:after="140" w:before="300"/>
+      </w:pPr>
+      <w:r>
+        <w:rPr>
+          <w:b/>
+          <w:bCs/>
+          <w:color w:val="1565C0"/>
+          <w:sz w:val="26"/>
+          <w:szCs w:val="26"/>
+        </w:rPr>
+        <w:t xml:space="preserve">5.2 Cellules à compléter en Phase B</w:t>
+      </w:r>
+    </w:p>
+    <w:tbl>
+      <w:tblPr>
+        <w:tblW w:type="dxa" w:w="9026"/>
+        <w:tblBorders>
+          <w:top w:val="single" w:color="auto" w:sz="4"/>
+          <w:left w:val="single" w:color="auto" w:sz="4"/>
+          <w:bottom w:val="single" w:color="auto" w:sz="4"/>
+          <w:right w:val="single" w:color="auto" w:sz="4"/>
+          <w:insideH w:val="single" w:color="auto" w:sz="4"/>
+          <w:insideV w:val="single" w:color="auto" w:sz="4"/>
+        </w:tblBorders>
+      </w:tblPr>
+      <w:tblGrid>
+        <w:gridCol w:w="600"/>
+        <w:gridCol w:w="2800"/>
+        <w:gridCol w:w="5626"/>
+      </w:tblGrid>
+      <w:tr>
+        <w:trPr>
+          <w:tblHeader/>
+        </w:trPr>
+        <w:tc>
+          <w:tcPr>
+            <w:tcW w:type="dxa" w:w="600"/>
+            <w:tcBorders>
+              <w:top w:val="single" w:color="BDBDBD" w:sz="4"/>
+              <w:left w:val="single" w:color="BDBDBD" w:sz="4"/>
+              <w:bottom w:val="single" w:color="BDBDBD" w:sz="4"/>
+              <w:right w:val="single" w:color="BDBDBD" w:sz="4"/>
+            </w:tcBorders>
+            <w:shd w:fill="E3F2FD" w:val="clear"/>
+            <w:tcMar>
+              <w:top w:type="dxa" w:w="100"/>
+              <w:left w:type="dxa" w:w="140"/>
+              <w:bottom w:type="dxa" w:w="100"/>
+              <w:right w:type="dxa" w:w="140"/>
+            </w:tcMar>
+          </w:tcPr>
+          <w:p>
+            <w:pPr>
+              <w:spacing w:after="40"/>
+            </w:pPr>
+            <w:r>
+              <w:rPr>
+                <w:b/>
+                <w:bCs/>
+                <w:color w:val="1565C0"/>
+                <w:sz w:val="20"/>
+                <w:szCs w:val="20"/>
+              </w:rPr>
+              <w:t xml:space="preserve">§</w:t>
+            </w:r>
+          </w:p>
+        </w:tc>
+        <w:tc>
+          <w:tcPr>
+            <w:tcW w:type="dxa" w:w="2800"/>
+            <w:tcBorders>
+              <w:top w:val="single" w:color="BDBDBD" w:sz="4"/>
+              <w:left w:val="single" w:color="BDBDBD" w:sz="4"/>
+              <w:bottom w:val="single" w:color="BDBDBD" w:sz="4"/>
+              <w:right w:val="single" w:color="BDBDBD" w:sz="4"/>
+            </w:tcBorders>
+            <w:shd w:fill="E3F2FD" w:val="clear"/>
+            <w:tcMar>
+              <w:top w:type="dxa" w:w="100"/>
+              <w:left w:type="dxa" w:w="140"/>
+              <w:bottom w:type="dxa" w:w="100"/>
+              <w:right w:type="dxa" w:w="140"/>
+            </w:tcMar>
+          </w:tcPr>
+          <w:p>
+            <w:pPr>
+              <w:spacing w:after="40"/>
+            </w:pPr>
+            <w:r>
+              <w:rPr>
+                <w:b/>
+                <w:bCs/>
+                <w:color w:val="1565C0"/>
+                <w:sz w:val="20"/>
+                <w:szCs w:val="20"/>
+              </w:rPr>
+              <w:t xml:space="preserve">Section du notebook</w:t>
+            </w:r>
+          </w:p>
+        </w:tc>
+        <w:tc>
+          <w:tcPr>
+            <w:tcW w:type="dxa" w:w="5626"/>
+            <w:tcBorders>
+              <w:top w:val="single" w:color="BDBDBD" w:sz="4"/>
+              <w:left w:val="single" w:color="BDBDBD" w:sz="4"/>
+              <w:bottom w:val="single" w:color="BDBDBD" w:sz="4"/>
+              <w:right w:val="single" w:color="BDBDBD" w:sz="4"/>
+            </w:tcBorders>
+            <w:shd w:fill="E3F2FD" w:val="clear"/>
+            <w:tcMar>
+              <w:top w:type="dxa" w:w="100"/>
+              <w:left w:type="dxa" w:w="140"/>
+              <w:bottom w:type="dxa" w:w="100"/>
+              <w:right w:type="dxa" w:w="140"/>
+            </w:tcMar>
+          </w:tcPr>
+          <w:p>
+            <w:pPr>
+              <w:spacing w:after="40"/>
+            </w:pPr>
+            <w:r>
+              <w:rPr>
+                <w:b/>
+                <w:bCs/>
+                <w:color w:val="1565C0"/>
+                <w:sz w:val="20"/>
+                <w:szCs w:val="20"/>
+              </w:rPr>
+              <w:t xml:space="preserve">Action attendue</w:t>
+            </w:r>
+          </w:p>
+        </w:tc>
+      </w:tr>
+      <w:tr>
+        <w:tc>
+          <w:tcPr>
+            <w:tcW w:type="dxa" w:w="600"/>
+            <w:tcBorders>
+              <w:top w:val="single" w:color="BDBDBD" w:sz="4"/>
+              <w:left w:val="single" w:color="BDBDBD" w:sz="4"/>
+              <w:bottom w:val="single" w:color="BDBDBD" w:sz="4"/>
+              <w:right w:val="single" w:color="BDBDBD" w:sz="4"/>
+            </w:tcBorders>
+            <w:tcMar>
+              <w:top w:type="dxa" w:w="100"/>
+              <w:left w:type="dxa" w:w="140"/>
+              <w:bottom w:type="dxa" w:w="100"/>
+              <w:right w:type="dxa" w:w="140"/>
+            </w:tcMar>
+          </w:tcPr>
+          <w:p>
+            <w:pPr>
+              <w:spacing w:after="40"/>
+            </w:pPr>
+            <w:r>
+              <w:rPr>
+                <w:b w:val="false"/>
+                <w:bCs w:val="false"/>
+                <w:color w:val="424242"/>
+                <w:sz w:val="20"/>
+                <w:szCs w:val="20"/>
+              </w:rPr>
+              <w:t xml:space="preserve">7</w:t>
+            </w:r>
+          </w:p>
+        </w:tc>
+        <w:tc>
+          <w:tcPr>
+            <w:tcW w:type="dxa" w:w="2800"/>
+            <w:tcBorders>
+              <w:top w:val="single" w:color="BDBDBD" w:sz="4"/>
+              <w:left w:val="single" w:color="BDBDBD" w:sz="4"/>
+              <w:bottom w:val="single" w:color="BDBDBD" w:sz="4"/>
+              <w:right w:val="single" w:color="BDBDBD" w:sz="4"/>
+            </w:tcBorders>
+            <w:tcMar>
+              <w:top w:type="dxa" w:w="100"/>
+              <w:left w:type="dxa" w:w="140"/>
+              <w:bottom w:type="dxa" w:w="100"/>
+              <w:right w:type="dxa" w:w="140"/>
+            </w:tcMar>
+          </w:tcPr>
+          <w:p>
+            <w:pPr>
+              <w:spacing w:after="40"/>
+            </w:pPr>
+            <w:r>
+              <w:rPr>
+                <w:b w:val="false"/>
+                <w:bCs w:val="false"/>
+                <w:color w:val="424242"/>
+                <w:sz w:val="20"/>
+                <w:szCs w:val="20"/>
+              </w:rPr>
+              <w:t xml:space="preserve">Leiden</w:t>
+            </w:r>
+          </w:p>
+        </w:tc>
+        <w:tc>
+          <w:tcPr>
+            <w:tcW w:type="dxa" w:w="5626"/>
+            <w:tcBorders>
+              <w:top w:val="single" w:color="BDBDBD" w:sz="4"/>
+              <w:left w:val="single" w:color="BDBDBD" w:sz="4"/>
+              <w:bottom w:val="single" w:color="BDBDBD" w:sz="4"/>
+              <w:right w:val="single" w:color="BDBDBD" w:sz="4"/>
+            </w:tcBorders>
+            <w:tcMar>
+              <w:top w:type="dxa" w:w="100"/>
+              <w:left w:type="dxa" w:w="140"/>
+              <w:bottom w:type="dxa" w:w="100"/>
+              <w:right w:type="dxa" w:w="140"/>
+            </w:tcMar>
+          </w:tcPr>
+          <w:p>
+            <w:pPr>
+              <w:spacing w:after="40"/>
+            </w:pPr>
+            <w:r>
+              <w:rPr>
+                <w:b w:val="false"/>
+                <w:bCs w:val="false"/>
+                <w:color w:val="424242"/>
+                <w:sz w:val="20"/>
+                <w:szCs w:val="20"/>
+              </w:rPr>
+              <w:t xml:space="preserve">Adapter la requête Cypher (gds.leiden.stream) sur le patron Louvain, mesurer durée et nombre de communautés</w:t>
+            </w:r>
+          </w:p>
+        </w:tc>
+      </w:tr>
+      <w:tr>
+        <w:tc>
+          <w:tcPr>
+            <w:tcW w:type="dxa" w:w="600"/>
+            <w:tcBorders>
+              <w:top w:val="single" w:color="BDBDBD" w:sz="4"/>
+              <w:left w:val="single" w:color="BDBDBD" w:sz="4"/>
+              <w:bottom w:val="single" w:color="BDBDBD" w:sz="4"/>
+              <w:right w:val="single" w:color="BDBDBD" w:sz="4"/>
+            </w:tcBorders>
+            <w:tcMar>
+              <w:top w:type="dxa" w:w="100"/>
+              <w:left w:type="dxa" w:w="140"/>
+              <w:bottom w:type="dxa" w:w="100"/>
+              <w:right w:type="dxa" w:w="140"/>
+            </w:tcMar>
+          </w:tcPr>
+          <w:p>
+            <w:pPr>
+              <w:spacing w:after="40"/>
+            </w:pPr>
+            <w:r>
+              <w:rPr>
+                <w:b w:val="false"/>
+                <w:bCs w:val="false"/>
+                <w:color w:val="424242"/>
+                <w:sz w:val="20"/>
+                <w:szCs w:val="20"/>
+              </w:rPr>
+              <w:t xml:space="preserve">7</w:t>
+            </w:r>
+          </w:p>
+        </w:tc>
+        <w:tc>
+          <w:tcPr>
+            <w:tcW w:type="dxa" w:w="2800"/>
+            <w:tcBorders>
+              <w:top w:val="single" w:color="BDBDBD" w:sz="4"/>
+              <w:left w:val="single" w:color="BDBDBD" w:sz="4"/>
+              <w:bottom w:val="single" w:color="BDBDBD" w:sz="4"/>
+              <w:right w:val="single" w:color="BDBDBD" w:sz="4"/>
+            </w:tcBorders>
+            <w:tcMar>
+              <w:top w:type="dxa" w:w="100"/>
+              <w:left w:type="dxa" w:w="140"/>
+              <w:bottom w:type="dxa" w:w="100"/>
+              <w:right w:type="dxa" w:w="140"/>
+            </w:tcMar>
+          </w:tcPr>
+          <w:p>
+            <w:pPr>
+              <w:spacing w:after="40"/>
+            </w:pPr>
+            <w:r>
+              <w:rPr>
+                <w:b w:val="false"/>
+                <w:bCs w:val="false"/>
+                <w:color w:val="424242"/>
+                <w:sz w:val="20"/>
+                <w:szCs w:val="20"/>
+              </w:rPr>
+              <w:t xml:space="preserve">Label Propagation</w:t>
+            </w:r>
+          </w:p>
+        </w:tc>
+        <w:tc>
+          <w:tcPr>
+            <w:tcW w:type="dxa" w:w="5626"/>
+            <w:tcBorders>
+              <w:top w:val="single" w:color="BDBDBD" w:sz="4"/>
+              <w:left w:val="single" w:color="BDBDBD" w:sz="4"/>
+              <w:bottom w:val="single" w:color="BDBDBD" w:sz="4"/>
+              <w:right w:val="single" w:color="BDBDBD" w:sz="4"/>
+            </w:tcBorders>
+            <w:tcMar>
+              <w:top w:type="dxa" w:w="100"/>
+              <w:left w:type="dxa" w:w="140"/>
+              <w:bottom w:type="dxa" w:w="100"/>
+              <w:right w:type="dxa" w:w="140"/>
+            </w:tcMar>
+          </w:tcPr>
+          <w:p>
+            <w:pPr>
+              <w:spacing w:after="40"/>
+            </w:pPr>
+            <w:r>
+              <w:rPr>
+                <w:b w:val="false"/>
+                <w:bCs w:val="false"/>
+                <w:color w:val="424242"/>
+                <w:sz w:val="20"/>
+                <w:szCs w:val="20"/>
+              </w:rPr>
+              <w:t xml:space="preserve">Adapter (gds.labelPropagation.stream), même méthode</w:t>
+            </w:r>
+          </w:p>
+        </w:tc>
+      </w:tr>
+      <w:tr>
+        <w:tc>
+          <w:tcPr>
+            <w:tcW w:type="dxa" w:w="600"/>
+            <w:tcBorders>
+              <w:top w:val="single" w:color="BDBDBD" w:sz="4"/>
+              <w:left w:val="single" w:color="BDBDBD" w:sz="4"/>
+              <w:bottom w:val="single" w:color="BDBDBD" w:sz="4"/>
+              <w:right w:val="single" w:color="BDBDBD" w:sz="4"/>
+            </w:tcBorders>
+            <w:tcMar>
+              <w:top w:type="dxa" w:w="100"/>
+              <w:left w:type="dxa" w:w="140"/>
+              <w:bottom w:type="dxa" w:w="100"/>
+              <w:right w:type="dxa" w:w="140"/>
+            </w:tcMar>
+          </w:tcPr>
+          <w:p>
+            <w:pPr>
+              <w:spacing w:after="40"/>
+            </w:pPr>
+            <w:r>
+              <w:rPr>
+                <w:b w:val="false"/>
+                <w:bCs w:val="false"/>
+                <w:color w:val="424242"/>
+                <w:sz w:val="20"/>
+                <w:szCs w:val="20"/>
+              </w:rPr>
+              <w:t xml:space="preserve">7</w:t>
+            </w:r>
+          </w:p>
+        </w:tc>
+        <w:tc>
+          <w:tcPr>
+            <w:tcW w:type="dxa" w:w="2800"/>
+            <w:tcBorders>
+              <w:top w:val="single" w:color="BDBDBD" w:sz="4"/>
+              <w:left w:val="single" w:color="BDBDBD" w:sz="4"/>
+              <w:bottom w:val="single" w:color="BDBDBD" w:sz="4"/>
+              <w:right w:val="single" w:color="BDBDBD" w:sz="4"/>
+            </w:tcBorders>
+            <w:tcMar>
+              <w:top w:type="dxa" w:w="100"/>
+              <w:left w:type="dxa" w:w="140"/>
+              <w:bottom w:type="dxa" w:w="100"/>
+              <w:right w:type="dxa" w:w="140"/>
+            </w:tcMar>
+          </w:tcPr>
+          <w:p>
+            <w:pPr>
+              <w:spacing w:after="40"/>
+            </w:pPr>
+            <w:r>
+              <w:rPr>
+                <w:b w:val="false"/>
+                <w:bCs w:val="false"/>
+                <w:color w:val="424242"/>
+                <w:sz w:val="20"/>
+                <w:szCs w:val="20"/>
+              </w:rPr>
+              <w:t xml:space="preserve">PageRank</w:t>
+            </w:r>
+          </w:p>
+        </w:tc>
+        <w:tc>
+          <w:tcPr>
+            <w:tcW w:type="dxa" w:w="5626"/>
+            <w:tcBorders>
+              <w:top w:val="single" w:color="BDBDBD" w:sz="4"/>
+              <w:left w:val="single" w:color="BDBDBD" w:sz="4"/>
+              <w:bottom w:val="single" w:color="BDBDBD" w:sz="4"/>
+              <w:right w:val="single" w:color="BDBDBD" w:sz="4"/>
+            </w:tcBorders>
+            <w:tcMar>
+              <w:top w:type="dxa" w:w="100"/>
+              <w:left w:type="dxa" w:w="140"/>
+              <w:bottom w:type="dxa" w:w="100"/>
+              <w:right w:type="dxa" w:w="140"/>
+            </w:tcMar>
+          </w:tcPr>
+          <w:p>
+            <w:pPr>
+              <w:spacing w:after="40"/>
+            </w:pPr>
+            <w:r>
+              <w:rPr>
+                <w:b w:val="false"/>
+                <w:bCs w:val="false"/>
+                <w:color w:val="424242"/>
+                <w:sz w:val="20"/>
+                <w:szCs w:val="20"/>
+              </w:rPr>
+              <w:t xml:space="preserve">Calculer les centralités, extraire le top 20 compétences</w:t>
+            </w:r>
+          </w:p>
+        </w:tc>
+      </w:tr>
+      <w:tr>
+        <w:tc>
+          <w:tcPr>
+            <w:tcW w:type="dxa" w:w="600"/>
+            <w:tcBorders>
+              <w:top w:val="single" w:color="BDBDBD" w:sz="4"/>
+              <w:left w:val="single" w:color="BDBDBD" w:sz="4"/>
+              <w:bottom w:val="single" w:color="BDBDBD" w:sz="4"/>
+              <w:right w:val="single" w:color="BDBDBD" w:sz="4"/>
+            </w:tcBorders>
+            <w:tcMar>
+              <w:top w:type="dxa" w:w="100"/>
+              <w:left w:type="dxa" w:w="140"/>
+              <w:bottom w:type="dxa" w:w="100"/>
+              <w:right w:type="dxa" w:w="140"/>
+            </w:tcMar>
+          </w:tcPr>
+          <w:p>
+            <w:pPr>
+              <w:spacing w:after="40"/>
+            </w:pPr>
+            <w:r>
+              <w:rPr>
+                <w:b w:val="false"/>
+                <w:bCs w:val="false"/>
+                <w:color w:val="424242"/>
+                <w:sz w:val="20"/>
+                <w:szCs w:val="20"/>
+              </w:rPr>
+              <w:t xml:space="preserve">8</w:t>
+            </w:r>
+          </w:p>
+        </w:tc>
+        <w:tc>
+          <w:tcPr>
+            <w:tcW w:type="dxa" w:w="2800"/>
+            <w:tcBorders>
+              <w:top w:val="single" w:color="BDBDBD" w:sz="4"/>
+              <w:left w:val="single" w:color="BDBDBD" w:sz="4"/>
+              <w:bottom w:val="single" w:color="BDBDBD" w:sz="4"/>
+              <w:right w:val="single" w:color="BDBDBD" w:sz="4"/>
+            </w:tcBorders>
+            <w:tcMar>
+              <w:top w:type="dxa" w:w="100"/>
+              <w:left w:type="dxa" w:w="140"/>
+              <w:bottom w:type="dxa" w:w="100"/>
+              <w:right w:type="dxa" w:w="140"/>
+            </w:tcMar>
+          </w:tcPr>
+          <w:p>
+            <w:pPr>
+              <w:spacing w:after="40"/>
+            </w:pPr>
+            <w:r>
+              <w:rPr>
+                <w:b w:val="false"/>
+                <w:bCs w:val="false"/>
+                <w:color w:val="424242"/>
+                <w:sz w:val="20"/>
+                <w:szCs w:val="20"/>
+              </w:rPr>
+              <w:t xml:space="preserve">Tableau comparatif §N2.2</w:t>
+            </w:r>
+          </w:p>
+        </w:tc>
+        <w:tc>
+          <w:tcPr>
+            <w:tcW w:type="dxa" w:w="5626"/>
+            <w:tcBorders>
+              <w:top w:val="single" w:color="BDBDBD" w:sz="4"/>
+              <w:left w:val="single" w:color="BDBDBD" w:sz="4"/>
+              <w:bottom w:val="single" w:color="BDBDBD" w:sz="4"/>
+              <w:right w:val="single" w:color="BDBDBD" w:sz="4"/>
+            </w:tcBorders>
+            <w:tcMar>
+              <w:top w:type="dxa" w:w="100"/>
+              <w:left w:type="dxa" w:w="140"/>
+              <w:bottom w:type="dxa" w:w="100"/>
+              <w:right w:type="dxa" w:w="140"/>
+            </w:tcMar>
+          </w:tcPr>
+          <w:p>
+            <w:pPr>
+              <w:spacing w:after="40"/>
+            </w:pPr>
+            <w:r>
+              <w:rPr>
+                <w:b w:val="false"/>
+                <w:bCs w:val="false"/>
+                <w:color w:val="424242"/>
+                <w:sz w:val="20"/>
+                <w:szCs w:val="20"/>
+              </w:rPr>
+              <w:t xml:space="preserve">Reporter les métriques des quatre algorithmes (communautés, modularité, temps, notes)</w:t>
+            </w:r>
+          </w:p>
+        </w:tc>
+      </w:tr>
+    </w:tbl>
+    <w:p>
+      <w:pPr>
+        <w:pStyle w:val="Heading2"/>
+        <w:spacing w:after="140" w:before="300"/>
+      </w:pPr>
+      <w:r>
+        <w:rPr>
+          <w:b/>
+          <w:bCs/>
+          <w:color w:val="1565C0"/>
+          <w:sz w:val="26"/>
+          <w:szCs w:val="26"/>
+        </w:rPr>
+        <w:t xml:space="preserve">5.3 Logique du découpage</w:t>
+      </w:r>
+    </w:p>
+    <w:p>
+      <w:pPr>
+        <w:spacing w:after="120" w:line="320"/>
+        <w:jc w:val="both"/>
+      </w:pPr>
+      <w:r>
+        <w:rPr>
+          <w:b w:val="false"/>
+          <w:bCs w:val="false"/>
+          <w:i w:val="false"/>
+          <w:iCs w:val="false"/>
+          <w:color w:val="424242"/>
+          <w:sz w:val="22"/>
+          <w:szCs w:val="22"/>
+        </w:rPr>
+        <w:t xml:space="preserve">Le travail livré clés en main couvre la plomberie technique : driver Neo4j, gestion des batches, optimisation des transactions, contraintes d'unicité. Cette partie est universelle et ne contribue pas à l'évaluation académique du volet.</w:t>
+      </w:r>
+    </w:p>
+    <w:p>
+      <w:pPr>
+        <w:spacing w:after="120" w:line="320"/>
+        <w:jc w:val="both"/>
+      </w:pPr>
+      <w:r>
+        <w:rPr>
+          <w:b w:val="false"/>
+          <w:bCs w:val="false"/>
+          <w:i w:val="false"/>
+          <w:iCs w:val="false"/>
+          <w:color w:val="424242"/>
+          <w:sz w:val="22"/>
+          <w:szCs w:val="22"/>
+        </w:rPr>
+        <w:t xml:space="preserve">Le travail à compléter couvre en revanche le contenu scientifique : choix des paramètres, exécution comparative des trois algorithmes restants, interprétation des résultats et rédaction de la synthèse. C'est ce périmètre qui porte la note §N2.2 du PRD et qui nourrit la section correspondante du rapport méthodologique L5.</w:t>
+      </w:r>
+    </w:p>
+    <w:p>
+      <w:pPr>
+        <w:pStyle w:val="Heading1"/>
+        <w:spacing w:after="200" w:before="400"/>
+      </w:pPr>
+      <w:r>
+        <w:rPr>
+          <w:b/>
+          <w:bCs/>
+          <w:color w:val="1565C0"/>
+          <w:sz w:val="32"/>
+          <w:szCs w:val="32"/>
+        </w:rPr>
+        <w:t xml:space="preserve">6. Décisions à valider avant Phase A</w:t>
       </w:r>
     </w:p>
     <w:p>

</xml_diff>

<commit_message>
docs(handoff): RACI en toutes lettres dans le tableau §2
Remplace les abréviations A R / C / I par les libellés complets Responsable
/ Consulté / Informé pour faciliter la lecture par le destinataire du
guide.
</commit_message>
<xml_diff>
--- a/docs/handoff/SKILLNAV_Guide_Modelisation_Structure_Mining.docx
+++ b/docs/handoff/SKILLNAV_Guide_Modelisation_Structure_Mining.docx
@@ -807,7 +807,7 @@
                 <w:sz w:val="20"/>
                 <w:szCs w:val="20"/>
               </w:rPr>
-              <w:t xml:space="preserve">A R</w:t>
+              <w:t xml:space="preserve">Responsable</w:t>
             </w:r>
           </w:p>
         </w:tc>
@@ -839,7 +839,7 @@
                 <w:sz w:val="20"/>
                 <w:szCs w:val="20"/>
               </w:rPr>
-              <w:t xml:space="preserve">C</w:t>
+              <w:t xml:space="preserve">Consulté</w:t>
             </w:r>
           </w:p>
         </w:tc>
@@ -905,7 +905,7 @@
                 <w:sz w:val="20"/>
                 <w:szCs w:val="20"/>
               </w:rPr>
-              <w:t xml:space="preserve">A R</w:t>
+              <w:t xml:space="preserve">Responsable</w:t>
             </w:r>
           </w:p>
         </w:tc>
@@ -937,7 +937,7 @@
                 <w:sz w:val="20"/>
                 <w:szCs w:val="20"/>
               </w:rPr>
-              <w:t xml:space="preserve">I</w:t>
+              <w:t xml:space="preserve">Informé</w:t>
             </w:r>
           </w:p>
         </w:tc>
@@ -1003,7 +1003,7 @@
                 <w:sz w:val="20"/>
                 <w:szCs w:val="20"/>
               </w:rPr>
-              <w:t xml:space="preserve">C</w:t>
+              <w:t xml:space="preserve">Consulté</w:t>
             </w:r>
           </w:p>
         </w:tc>
@@ -1035,7 +1035,7 @@
                 <w:sz w:val="20"/>
                 <w:szCs w:val="20"/>
               </w:rPr>
-              <w:t xml:space="preserve">A R</w:t>
+              <w:t xml:space="preserve">Responsable</w:t>
             </w:r>
           </w:p>
         </w:tc>
@@ -1101,7 +1101,7 @@
                 <w:sz w:val="20"/>
                 <w:szCs w:val="20"/>
               </w:rPr>
-              <w:t xml:space="preserve">I</w:t>
+              <w:t xml:space="preserve">Informé</w:t>
             </w:r>
           </w:p>
         </w:tc>
@@ -1133,7 +1133,7 @@
                 <w:sz w:val="20"/>
                 <w:szCs w:val="20"/>
               </w:rPr>
-              <w:t xml:space="preserve">A R</w:t>
+              <w:t xml:space="preserve">Responsable</w:t>
             </w:r>
           </w:p>
         </w:tc>
@@ -1199,7 +1199,7 @@
                 <w:sz w:val="20"/>
                 <w:szCs w:val="20"/>
               </w:rPr>
-              <w:t xml:space="preserve">I</w:t>
+              <w:t xml:space="preserve">Informé</w:t>
             </w:r>
           </w:p>
         </w:tc>
@@ -1231,7 +1231,7 @@
                 <w:sz w:val="20"/>
                 <w:szCs w:val="20"/>
               </w:rPr>
-              <w:t xml:space="preserve">A R</w:t>
+              <w:t xml:space="preserve">Responsable</w:t>
             </w:r>
           </w:p>
         </w:tc>
@@ -1297,7 +1297,7 @@
                 <w:sz w:val="20"/>
                 <w:szCs w:val="20"/>
               </w:rPr>
-              <w:t xml:space="preserve">A R</w:t>
+              <w:t xml:space="preserve">Responsable</w:t>
             </w:r>
           </w:p>
         </w:tc>
@@ -1329,7 +1329,7 @@
                 <w:sz w:val="20"/>
                 <w:szCs w:val="20"/>
               </w:rPr>
-              <w:t xml:space="preserve">C</w:t>
+              <w:t xml:space="preserve">Consulté</w:t>
             </w:r>
           </w:p>
         </w:tc>
@@ -1395,7 +1395,7 @@
                 <w:sz w:val="20"/>
                 <w:szCs w:val="20"/>
               </w:rPr>
-              <w:t xml:space="preserve">I</w:t>
+              <w:t xml:space="preserve">Informé</w:t>
             </w:r>
           </w:p>
         </w:tc>
@@ -1427,7 +1427,7 @@
                 <w:sz w:val="20"/>
                 <w:szCs w:val="20"/>
               </w:rPr>
-              <w:t xml:space="preserve">A R</w:t>
+              <w:t xml:space="preserve">Responsable</w:t>
             </w:r>
           </w:p>
         </w:tc>
@@ -1493,7 +1493,7 @@
                 <w:sz w:val="20"/>
                 <w:szCs w:val="20"/>
               </w:rPr>
-              <w:t xml:space="preserve">A R</w:t>
+              <w:t xml:space="preserve">Responsable</w:t>
             </w:r>
           </w:p>
         </w:tc>
@@ -1525,7 +1525,7 @@
                 <w:sz w:val="20"/>
                 <w:szCs w:val="20"/>
               </w:rPr>
-              <w:t xml:space="preserve">I</w:t>
+              <w:t xml:space="preserve">Informé</w:t>
             </w:r>
           </w:p>
         </w:tc>

</xml_diff>